<commit_message>
feat: implement full-width responsive studio layout, QA E2E test tracking suite, and update documentation to v3.8
</commit_message>
<xml_diff>
--- a/FSD_WORK_TRACKER_PRO.docx
+++ b/FSD_WORK_TRACKER_PRO.docx
@@ -46,7 +46,7 @@
           <w:color w:val="4F46E5"/>
           <w:sz w:val="26"/>
         </w:rPr>
-        <w:t>Work Tracker Pro (TrackerKerja) v3.7</w:t>
+        <w:t>Work Tracker Pro (TrackerKerja) v3.8</w:t>
       </w:r>
     </w:p>
     <w:p>
@@ -60,7 +60,7 @@
           <w:color w:val="475569"/>
           <w:sz w:val="21"/>
         </w:rPr>
-        <w:t>Spesifikasi Fungsional Komprehensif Arsitektur Sistem, Modul Operasional, Alur Bisnis, Multi-Company Isolation, Project Financials, dan RBAC</w:t>
+        <w:t>Spesifikasi Fungsional Komprehensif Arsitektur Sistem, Modul Operasional, Full-Width Studio Layout, Projects REST API, QA E2E Testing, dan RBAC</w:t>
       </w:r>
     </w:p>
     <w:p>
@@ -147,7 +147,7 @@
                 <w:color w:val="0F172A"/>
                 <w:sz w:val="19"/>
               </w:rPr>
-              <w:t>FSD-WTP-3.7-202609</w:t>
+              <w:t>FSD-WTP-3.8-202610</w:t>
             </w:r>
           </w:p>
         </w:tc>
@@ -215,7 +215,7 @@
                 <w:color w:val="0F172A"/>
                 <w:sz w:val="19"/>
               </w:rPr>
-              <w:t>v3.7 Multi-Company Corporate Isolation &amp; Project Financials Edition</w:t>
+              <w:t>v3.8 Multi-Company Corporate Isolation &amp; Project Financials Edition</w:t>
             </w:r>
           </w:p>
         </w:tc>
@@ -282,7 +282,7 @@
                 <w:color w:val="0F172A"/>
                 <w:sz w:val="19"/>
               </w:rPr>
-              <w:t>29 September 2026</w:t>
+              <w:t>08 Oktober 2026</w:t>
             </w:r>
           </w:p>
         </w:tc>
@@ -618,7 +618,7 @@
           <w:color w:val="1E293B"/>
           <w:sz w:val="19"/>
         </w:rPr>
-        <w:t>: 3.7 (Multi-Company Corporate Code Isolation, Project Finance, Admin Company Grouping &amp; Gamification Edition)</w:t>
+        <w:t>: 3.8 (Full-Width Responsive Studio Layout, QA E2E Tracking Suite &amp; Projects REST API Edition)</w:t>
       </w:r>
     </w:p>
     <w:p>
@@ -934,7 +934,7 @@
           <w:color w:val="1E293B"/>
           <w:sz w:val="19"/>
         </w:rPr>
-        <w:t>: 29 September 2026</w:t>
+        <w:t>: 08 Oktober 2026</w:t>
       </w:r>
     </w:p>
     <w:p>
@@ -1715,6 +1715,58 @@
           <w:u w:val="single"/>
         </w:rPr>
         <w:t>5.20 Modul Gamifikasi, Daily Check-In, Aturan Streak, Master Badge Gaul &amp; Klaim Hadiah</w:t>
+      </w:r>
+    </w:p>
+    <w:p>
+      <w:pPr>
+        <w:spacing w:before="20" w:after="40" w:line="276" w:lineRule="auto"/>
+        <w:ind w:left="720"/>
+      </w:pPr>
+      <w:r>
+        <w:rPr>
+          <w:rFonts w:ascii="Arial" w:hAnsi="Arial"/>
+          <w:b/>
+          <w:color w:val="2563EB"/>
+          <w:sz w:val="19"/>
+        </w:rPr>
+        <w:t xml:space="preserve">⁃ </w:t>
+      </w:r>
+      <w:r>
+        <w:rPr>
+          <w:rFonts w:ascii="Calibri" w:hAnsi="Calibri"/>
+          <w:b w:val="0"/>
+          <w:i w:val="0"/>
+          <w:color w:val="2563EB"/>
+          <w:sz w:val="19"/>
+          <w:u w:val="single"/>
+        </w:rPr>
+        <w:t>5.21 Modul Tata Letak Studio Bentang Penuh (Full-Width Responsive Studio Layout)</w:t>
+      </w:r>
+    </w:p>
+    <w:p>
+      <w:pPr>
+        <w:spacing w:before="20" w:after="40" w:line="276" w:lineRule="auto"/>
+        <w:ind w:left="720"/>
+      </w:pPr>
+      <w:r>
+        <w:rPr>
+          <w:rFonts w:ascii="Arial" w:hAnsi="Arial"/>
+          <w:b/>
+          <w:color w:val="2563EB"/>
+          <w:sz w:val="19"/>
+        </w:rPr>
+        <w:t xml:space="preserve">⁃ </w:t>
+      </w:r>
+      <w:r>
+        <w:rPr>
+          <w:rFonts w:ascii="Calibri" w:hAnsi="Calibri"/>
+          <w:b w:val="0"/>
+          <w:i w:val="0"/>
+          <w:color w:val="2563EB"/>
+          <w:sz w:val="19"/>
+          <w:u w:val="single"/>
+        </w:rPr>
+        <w:t>5.22 Paket Pengujian Mutu (Quality Assurance - QA) &amp; Matriks Pelacakan End-to-End</w:t>
       </w:r>
     </w:p>
     <w:p>
@@ -22854,6 +22906,1336 @@
     </w:p>
     <w:p>
       <w:pPr>
+        <w:keepNext/>
+        <w:spacing w:before="160" w:after="40"/>
+      </w:pPr>
+      <w:r>
+        <w:rPr>
+          <w:rFonts w:ascii="Calibri" w:hAnsi="Calibri"/>
+          <w:b/>
+          <w:color w:val="1E293B"/>
+          <w:sz w:val="23"/>
+        </w:rPr>
+        <w:t>5.21 Modul Tata Letak Studio Bentang Penuh (Full-Width Responsive Studio Layout)</w:t>
+      </w:r>
+    </w:p>
+    <w:p>
+      <w:pPr>
+        <w:spacing w:before="0" w:after="80" w:line="276" w:lineRule="auto"/>
+      </w:pPr>
+      <w:r>
+        <w:rPr>
+          <w:rFonts w:ascii="Calibri" w:hAnsi="Calibri"/>
+          <w:b w:val="0"/>
+          <w:i w:val="0"/>
+          <w:color w:val="1E293B"/>
+          <w:sz w:val="20"/>
+        </w:rPr>
+        <w:t>Seluruh formulir kerja inti telah dimodernisasi dari struktur sempit (</w:t>
+      </w:r>
+      <w:r>
+        <w:rPr>
+          <w:rFonts w:ascii="Consolas" w:hAnsi="Consolas"/>
+          <w:b w:val="0"/>
+          <w:i w:val="0"/>
+          <w:color w:val="C2410C"/>
+          <w:sz w:val="17"/>
+        </w:rPr>
+        <w:t>max-w-4xl</w:t>
+      </w:r>
+      <w:r>
+        <w:rPr>
+          <w:rFonts w:ascii="Calibri" w:hAnsi="Calibri"/>
+          <w:b w:val="0"/>
+          <w:i w:val="0"/>
+          <w:color w:val="1E293B"/>
+          <w:sz w:val="20"/>
+        </w:rPr>
+        <w:t xml:space="preserve">, </w:t>
+      </w:r>
+      <w:r>
+        <w:rPr>
+          <w:rFonts w:ascii="Consolas" w:hAnsi="Consolas"/>
+          <w:b w:val="0"/>
+          <w:i w:val="0"/>
+          <w:color w:val="C2410C"/>
+          <w:sz w:val="17"/>
+        </w:rPr>
+        <w:t>max-w-2xl</w:t>
+      </w:r>
+      <w:r>
+        <w:rPr>
+          <w:rFonts w:ascii="Calibri" w:hAnsi="Calibri"/>
+          <w:b w:val="0"/>
+          <w:i w:val="0"/>
+          <w:color w:val="1E293B"/>
+          <w:sz w:val="20"/>
+        </w:rPr>
+        <w:t>) menjadi tata letak studio bentang penuh (</w:t>
+      </w:r>
+      <w:r>
+        <w:rPr>
+          <w:rFonts w:ascii="Consolas" w:hAnsi="Consolas"/>
+          <w:b w:val="0"/>
+          <w:i w:val="0"/>
+          <w:color w:val="C2410C"/>
+          <w:sz w:val="17"/>
+        </w:rPr>
+        <w:t>w-full</w:t>
+      </w:r>
+      <w:r>
+        <w:rPr>
+          <w:rFonts w:ascii="Calibri" w:hAnsi="Calibri"/>
+          <w:b w:val="0"/>
+          <w:i w:val="0"/>
+          <w:color w:val="1E293B"/>
+          <w:sz w:val="20"/>
+        </w:rPr>
+        <w:t xml:space="preserve"> dengan CSS Grid 12-kolom </w:t>
+      </w:r>
+      <w:r>
+        <w:rPr>
+          <w:rFonts w:ascii="Consolas" w:hAnsi="Consolas"/>
+          <w:b w:val="0"/>
+          <w:i w:val="0"/>
+          <w:color w:val="C2410C"/>
+          <w:sz w:val="17"/>
+        </w:rPr>
+        <w:t>lg:grid-cols-12</w:t>
+      </w:r>
+      <w:r>
+        <w:rPr>
+          <w:rFonts w:ascii="Calibri" w:hAnsi="Calibri"/>
+          <w:b w:val="0"/>
+          <w:i w:val="0"/>
+          <w:color w:val="1E293B"/>
+          <w:sz w:val="20"/>
+        </w:rPr>
+        <w:t>) yang mengoptimalkan penggunaan monitor resolusi tinggi (1080p, 1440p, 4K) dan tetap responsif pada perangkat seluler:</w:t>
+      </w:r>
+    </w:p>
+    <w:p>
+      <w:pPr>
+        <w:spacing w:before="20" w:after="40" w:line="276" w:lineRule="auto"/>
+        <w:ind w:left="360"/>
+      </w:pPr>
+      <w:r>
+        <w:rPr>
+          <w:rFonts w:ascii="Arial" w:hAnsi="Arial"/>
+          <w:b/>
+          <w:color w:val="2563EB"/>
+          <w:sz w:val="19"/>
+        </w:rPr>
+        <w:t xml:space="preserve">• </w:t>
+      </w:r>
+      <w:r>
+        <w:rPr>
+          <w:rFonts w:ascii="Calibri" w:hAnsi="Calibri"/>
+          <w:b/>
+          <w:i w:val="0"/>
+          <w:color w:val="1E293B"/>
+          <w:sz w:val="19"/>
+        </w:rPr>
+        <w:t>5.21.1 Detail &amp; Edit Tugas (`/Task/Edit/{id}`)</w:t>
+      </w:r>
+      <w:r>
+        <w:rPr>
+          <w:rFonts w:ascii="Calibri" w:hAnsi="Calibri"/>
+          <w:b w:val="0"/>
+          <w:i w:val="0"/>
+          <w:color w:val="1E293B"/>
+          <w:sz w:val="19"/>
+        </w:rPr>
+        <w:t>:</w:t>
+      </w:r>
+    </w:p>
+    <w:p>
+      <w:pPr>
+        <w:spacing w:before="20" w:after="40" w:line="276" w:lineRule="auto"/>
+        <w:ind w:left="720"/>
+      </w:pPr>
+      <w:r>
+        <w:rPr>
+          <w:rFonts w:ascii="Arial" w:hAnsi="Arial"/>
+          <w:b/>
+          <w:color w:val="2563EB"/>
+          <w:sz w:val="19"/>
+        </w:rPr>
+        <w:t xml:space="preserve">⁃ </w:t>
+      </w:r>
+      <w:r>
+        <w:rPr>
+          <w:rFonts w:ascii="Calibri" w:hAnsi="Calibri"/>
+          <w:b w:val="0"/>
+          <w:i/>
+          <w:color w:val="1E293B"/>
+          <w:sz w:val="19"/>
+        </w:rPr>
+        <w:t>Header Eksekutif Bentang Penuh</w:t>
+      </w:r>
+      <w:r>
+        <w:rPr>
+          <w:rFonts w:ascii="Calibri" w:hAnsi="Calibri"/>
+          <w:b w:val="0"/>
+          <w:i w:val="0"/>
+          <w:color w:val="1E293B"/>
+          <w:sz w:val="19"/>
+        </w:rPr>
+        <w:t>: Kode tugas, kode induk, tanggal, judul tugas, dan total durasi waktu kerja.</w:t>
+      </w:r>
+    </w:p>
+    <w:p>
+      <w:pPr>
+        <w:spacing w:before="20" w:after="40" w:line="276" w:lineRule="auto"/>
+        <w:ind w:left="720"/>
+      </w:pPr>
+      <w:r>
+        <w:rPr>
+          <w:rFonts w:ascii="Arial" w:hAnsi="Arial"/>
+          <w:b/>
+          <w:color w:val="2563EB"/>
+          <w:sz w:val="19"/>
+        </w:rPr>
+        <w:t xml:space="preserve">⁃ </w:t>
+      </w:r>
+      <w:r>
+        <w:rPr>
+          <w:rFonts w:ascii="Calibri" w:hAnsi="Calibri"/>
+          <w:b w:val="0"/>
+          <w:i/>
+          <w:color w:val="1E293B"/>
+          <w:sz w:val="19"/>
+        </w:rPr>
+        <w:t>Kolom Kiri (8 Kolom)</w:t>
+      </w:r>
+      <w:r>
+        <w:rPr>
+          <w:rFonts w:ascii="Calibri" w:hAnsi="Calibri"/>
+          <w:b w:val="0"/>
+          <w:i w:val="0"/>
+          <w:color w:val="1E293B"/>
+          <w:sz w:val="19"/>
+        </w:rPr>
+        <w:t>: Input judul tugas, deskripsi kerja, panel dokumentasi kendala (</w:t>
+      </w:r>
+      <w:r>
+        <w:rPr>
+          <w:rFonts w:ascii="Calibri" w:hAnsi="Calibri"/>
+          <w:b w:val="0"/>
+          <w:i/>
+          <w:color w:val="1E293B"/>
+          <w:sz w:val="19"/>
+        </w:rPr>
+        <w:t>Obstacle</w:t>
+      </w:r>
+      <w:r>
+        <w:rPr>
+          <w:rFonts w:ascii="Calibri" w:hAnsi="Calibri"/>
+          <w:b w:val="0"/>
+          <w:i w:val="0"/>
+          <w:color w:val="1E293B"/>
+          <w:sz w:val="19"/>
+        </w:rPr>
+        <w:t>) bernuansa amber dan solusi (</w:t>
+      </w:r>
+      <w:r>
+        <w:rPr>
+          <w:rFonts w:ascii="Calibri" w:hAnsi="Calibri"/>
+          <w:b w:val="0"/>
+          <w:i/>
+          <w:color w:val="1E293B"/>
+          <w:sz w:val="19"/>
+        </w:rPr>
+        <w:t>Solution</w:t>
+      </w:r>
+      <w:r>
+        <w:rPr>
+          <w:rFonts w:ascii="Calibri" w:hAnsi="Calibri"/>
+          <w:b w:val="0"/>
+          <w:i w:val="0"/>
+          <w:color w:val="1E293B"/>
+          <w:sz w:val="19"/>
+        </w:rPr>
+        <w:t>) bernuansa emerald, pencatatan jam kerja manual terintegrasi (+30m, +1h, +2h, +4h, Reset), riwayat sesi kerja (</w:t>
+      </w:r>
+      <w:r>
+        <w:rPr>
+          <w:rFonts w:ascii="Calibri" w:hAnsi="Calibri"/>
+          <w:b w:val="0"/>
+          <w:i/>
+          <w:color w:val="1E293B"/>
+          <w:sz w:val="19"/>
+        </w:rPr>
+        <w:t>Work Sessions</w:t>
+      </w:r>
+      <w:r>
+        <w:rPr>
+          <w:rFonts w:ascii="Calibri" w:hAnsi="Calibri"/>
+          <w:b w:val="0"/>
+          <w:i w:val="0"/>
+          <w:color w:val="1E293B"/>
+          <w:sz w:val="19"/>
+        </w:rPr>
+        <w:t>), dan catatan terkait.</w:t>
+      </w:r>
+    </w:p>
+    <w:p>
+      <w:pPr>
+        <w:spacing w:before="20" w:after="40" w:line="276" w:lineRule="auto"/>
+        <w:ind w:left="720"/>
+      </w:pPr>
+      <w:r>
+        <w:rPr>
+          <w:rFonts w:ascii="Arial" w:hAnsi="Arial"/>
+          <w:b/>
+          <w:color w:val="2563EB"/>
+          <w:sz w:val="19"/>
+        </w:rPr>
+        <w:t xml:space="preserve">⁃ </w:t>
+      </w:r>
+      <w:r>
+        <w:rPr>
+          <w:rFonts w:ascii="Calibri" w:hAnsi="Calibri"/>
+          <w:b w:val="0"/>
+          <w:i/>
+          <w:color w:val="1E293B"/>
+          <w:sz w:val="19"/>
+        </w:rPr>
+        <w:t>Kolom Kanan (4 Kolom - Sticky)</w:t>
+      </w:r>
+      <w:r>
+        <w:rPr>
+          <w:rFonts w:ascii="Calibri" w:hAnsi="Calibri"/>
+          <w:b w:val="0"/>
+          <w:i w:val="0"/>
+          <w:color w:val="1E293B"/>
+          <w:sz w:val="19"/>
+        </w:rPr>
+        <w:t>: Dropdown status alur kerja, slider progress persentase (0-100%), penugasan PIC, prioritas, milestone waterfall SDLC, asosiasi proyek/kategori, jadwal mulai/deadline, dan hierarki sub-tugas (</w:t>
+      </w:r>
+      <w:r>
+        <w:rPr>
+          <w:rFonts w:ascii="Calibri" w:hAnsi="Calibri"/>
+          <w:b w:val="0"/>
+          <w:i/>
+          <w:color w:val="1E293B"/>
+          <w:sz w:val="19"/>
+        </w:rPr>
+        <w:t>Child Tasks</w:t>
+      </w:r>
+      <w:r>
+        <w:rPr>
+          <w:rFonts w:ascii="Calibri" w:hAnsi="Calibri"/>
+          <w:b w:val="0"/>
+          <w:i w:val="0"/>
+          <w:color w:val="1E293B"/>
+          <w:sz w:val="19"/>
+        </w:rPr>
+        <w:t>).</w:t>
+      </w:r>
+    </w:p>
+    <w:p>
+      <w:pPr>
+        <w:spacing w:before="20" w:after="40" w:line="276" w:lineRule="auto"/>
+        <w:ind w:left="720"/>
+      </w:pPr>
+      <w:r>
+        <w:rPr>
+          <w:rFonts w:ascii="Arial" w:hAnsi="Arial"/>
+          <w:b/>
+          <w:color w:val="2563EB"/>
+          <w:sz w:val="19"/>
+        </w:rPr>
+        <w:t xml:space="preserve">⁃ </w:t>
+      </w:r>
+      <w:r>
+        <w:rPr>
+          <w:rFonts w:ascii="Calibri" w:hAnsi="Calibri"/>
+          <w:b w:val="0"/>
+          <w:i/>
+          <w:color w:val="1E293B"/>
+          <w:sz w:val="19"/>
+        </w:rPr>
+        <w:t>Bilah Aksi Mengambang (Sticky Bottom Action Bar)</w:t>
+      </w:r>
+      <w:r>
+        <w:rPr>
+          <w:rFonts w:ascii="Calibri" w:hAnsi="Calibri"/>
+          <w:b w:val="0"/>
+          <w:i w:val="0"/>
+          <w:color w:val="1E293B"/>
+          <w:sz w:val="19"/>
+        </w:rPr>
+        <w:t xml:space="preserve">: Membentang penuh di bawah layar memuat ringkasan status dan tombol </w:t>
+      </w:r>
+      <w:r>
+        <w:rPr>
+          <w:rFonts w:ascii="Calibri" w:hAnsi="Calibri"/>
+          <w:b w:val="0"/>
+          <w:i/>
+          <w:color w:val="1E293B"/>
+          <w:sz w:val="19"/>
+        </w:rPr>
+        <w:t>"Simpan Semua Perubahan"</w:t>
+      </w:r>
+      <w:r>
+        <w:rPr>
+          <w:rFonts w:ascii="Calibri" w:hAnsi="Calibri"/>
+          <w:b w:val="0"/>
+          <w:i w:val="0"/>
+          <w:color w:val="1E293B"/>
+          <w:sz w:val="19"/>
+        </w:rPr>
+        <w:t>.</w:t>
+      </w:r>
+    </w:p>
+    <w:p>
+      <w:pPr>
+        <w:spacing w:before="20" w:after="40" w:line="276" w:lineRule="auto"/>
+        <w:ind w:left="360"/>
+      </w:pPr>
+      <w:r>
+        <w:rPr>
+          <w:rFonts w:ascii="Arial" w:hAnsi="Arial"/>
+          <w:b/>
+          <w:color w:val="2563EB"/>
+          <w:sz w:val="19"/>
+        </w:rPr>
+        <w:t xml:space="preserve">• </w:t>
+      </w:r>
+      <w:r>
+        <w:rPr>
+          <w:rFonts w:ascii="Calibri" w:hAnsi="Calibri"/>
+          <w:b/>
+          <w:i w:val="0"/>
+          <w:color w:val="1E293B"/>
+          <w:sz w:val="19"/>
+        </w:rPr>
+        <w:t>5.21.2 Edit Catatan &amp; Dokumentasi (`/Note/Edit/{id}`)</w:t>
+      </w:r>
+      <w:r>
+        <w:rPr>
+          <w:rFonts w:ascii="Calibri" w:hAnsi="Calibri"/>
+          <w:b w:val="0"/>
+          <w:i w:val="0"/>
+          <w:color w:val="1E293B"/>
+          <w:sz w:val="19"/>
+        </w:rPr>
+        <w:t>:</w:t>
+      </w:r>
+    </w:p>
+    <w:p>
+      <w:pPr>
+        <w:spacing w:before="20" w:after="40" w:line="276" w:lineRule="auto"/>
+        <w:ind w:left="720"/>
+      </w:pPr>
+      <w:r>
+        <w:rPr>
+          <w:rFonts w:ascii="Arial" w:hAnsi="Arial"/>
+          <w:b/>
+          <w:color w:val="2563EB"/>
+          <w:sz w:val="19"/>
+        </w:rPr>
+        <w:t xml:space="preserve">⁃ </w:t>
+      </w:r>
+      <w:r>
+        <w:rPr>
+          <w:rFonts w:ascii="Calibri" w:hAnsi="Calibri"/>
+          <w:b w:val="0"/>
+          <w:i w:val="0"/>
+          <w:color w:val="1E293B"/>
+          <w:sz w:val="19"/>
+        </w:rPr>
+        <w:t>Kolom utama 8-kolom menyajikan area pengetikan editor Quill.js yang luas (min-height 420px) serta panel upload dan riwayat lampiran multi-file terorganisir per folder user.</w:t>
+      </w:r>
+    </w:p>
+    <w:p>
+      <w:pPr>
+        <w:spacing w:before="20" w:after="40" w:line="276" w:lineRule="auto"/>
+        <w:ind w:left="720"/>
+      </w:pPr>
+      <w:r>
+        <w:rPr>
+          <w:rFonts w:ascii="Arial" w:hAnsi="Arial"/>
+          <w:b/>
+          <w:color w:val="2563EB"/>
+          <w:sz w:val="19"/>
+        </w:rPr>
+        <w:t xml:space="preserve">⁃ </w:t>
+      </w:r>
+      <w:r>
+        <w:rPr>
+          <w:rFonts w:ascii="Calibri" w:hAnsi="Calibri"/>
+          <w:b w:val="0"/>
+          <w:i w:val="0"/>
+          <w:color w:val="1E293B"/>
+          <w:sz w:val="19"/>
+        </w:rPr>
+        <w:t>Kolom samping 4-kolom memuat kategori, warna aksen catatan, penautan ke tugas, sematkan (pin), dan tombol simpan.</w:t>
+      </w:r>
+    </w:p>
+    <w:p>
+      <w:pPr>
+        <w:spacing w:before="20" w:after="40" w:line="276" w:lineRule="auto"/>
+        <w:ind w:left="360"/>
+      </w:pPr>
+      <w:r>
+        <w:rPr>
+          <w:rFonts w:ascii="Arial" w:hAnsi="Arial"/>
+          <w:b/>
+          <w:color w:val="2563EB"/>
+          <w:sz w:val="19"/>
+        </w:rPr>
+        <w:t xml:space="preserve">• </w:t>
+      </w:r>
+      <w:r>
+        <w:rPr>
+          <w:rFonts w:ascii="Calibri" w:hAnsi="Calibri"/>
+          <w:b/>
+          <w:i w:val="0"/>
+          <w:color w:val="1E293B"/>
+          <w:sz w:val="19"/>
+        </w:rPr>
+        <w:t>5.21.3 Edit Anggota Tim (`/Member/Edit/{id}`)</w:t>
+      </w:r>
+      <w:r>
+        <w:rPr>
+          <w:rFonts w:ascii="Calibri" w:hAnsi="Calibri"/>
+          <w:b w:val="0"/>
+          <w:i w:val="0"/>
+          <w:color w:val="1E293B"/>
+          <w:sz w:val="19"/>
+        </w:rPr>
+        <w:t>:</w:t>
+      </w:r>
+    </w:p>
+    <w:p>
+      <w:pPr>
+        <w:spacing w:before="20" w:after="40" w:line="276" w:lineRule="auto"/>
+        <w:ind w:left="720"/>
+      </w:pPr>
+      <w:r>
+        <w:rPr>
+          <w:rFonts w:ascii="Arial" w:hAnsi="Arial"/>
+          <w:b/>
+          <w:color w:val="2563EB"/>
+          <w:sz w:val="19"/>
+        </w:rPr>
+        <w:t xml:space="preserve">⁃ </w:t>
+      </w:r>
+      <w:r>
+        <w:rPr>
+          <w:rFonts w:ascii="Calibri" w:hAnsi="Calibri"/>
+          <w:b w:val="0"/>
+          <w:i w:val="0"/>
+          <w:color w:val="1E293B"/>
+          <w:sz w:val="19"/>
+        </w:rPr>
+        <w:t>Kolom utama 8-kolom memuat nama lengkap, email, spesialisasi jabatan, dan nomor kontak WhatsApp.</w:t>
+      </w:r>
+    </w:p>
+    <w:p>
+      <w:pPr>
+        <w:spacing w:before="20" w:after="40" w:line="276" w:lineRule="auto"/>
+        <w:ind w:left="720"/>
+      </w:pPr>
+      <w:r>
+        <w:rPr>
+          <w:rFonts w:ascii="Arial" w:hAnsi="Arial"/>
+          <w:b/>
+          <w:color w:val="2563EB"/>
+          <w:sz w:val="19"/>
+        </w:rPr>
+        <w:t xml:space="preserve">⁃ </w:t>
+      </w:r>
+      <w:r>
+        <w:rPr>
+          <w:rFonts w:ascii="Calibri" w:hAnsi="Calibri"/>
+          <w:b w:val="0"/>
+          <w:i w:val="0"/>
+          <w:color w:val="1E293B"/>
+          <w:sz w:val="19"/>
+        </w:rPr>
+        <w:t>Kolom samping 4-kolom memuat pengaturan hak akses peran (</w:t>
+      </w:r>
+      <w:r>
+        <w:rPr>
+          <w:rFonts w:ascii="Calibri" w:hAnsi="Calibri"/>
+          <w:b w:val="0"/>
+          <w:i/>
+          <w:color w:val="1E293B"/>
+          <w:sz w:val="19"/>
+        </w:rPr>
+        <w:t>Role Admin vs Member</w:t>
+      </w:r>
+      <w:r>
+        <w:rPr>
+          <w:rFonts w:ascii="Calibri" w:hAnsi="Calibri"/>
+          <w:b w:val="0"/>
+          <w:i w:val="0"/>
+          <w:color w:val="1E293B"/>
+          <w:sz w:val="19"/>
+        </w:rPr>
+        <w:t>), pemilih 8 warna aksen avatar dengan pratinjau inisial langsung, dan tombol simpan.</w:t>
+      </w:r>
+    </w:p>
+    <w:p>
+      <w:pPr>
+        <w:spacing w:before="20" w:after="40" w:line="276" w:lineRule="auto"/>
+        <w:ind w:left="360"/>
+      </w:pPr>
+      <w:r>
+        <w:rPr>
+          <w:rFonts w:ascii="Arial" w:hAnsi="Arial"/>
+          <w:b/>
+          <w:color w:val="2563EB"/>
+          <w:sz w:val="19"/>
+        </w:rPr>
+        <w:t xml:space="preserve">• </w:t>
+      </w:r>
+      <w:r>
+        <w:rPr>
+          <w:rFonts w:ascii="Calibri" w:hAnsi="Calibri"/>
+          <w:b/>
+          <w:i w:val="0"/>
+          <w:color w:val="1E293B"/>
+          <w:sz w:val="19"/>
+        </w:rPr>
+        <w:t>5.21.4 Profil Pengguna &amp; Ultra-Wide Cover (`/Account/Profile`)</w:t>
+      </w:r>
+      <w:r>
+        <w:rPr>
+          <w:rFonts w:ascii="Calibri" w:hAnsi="Calibri"/>
+          <w:b w:val="0"/>
+          <w:i w:val="0"/>
+          <w:color w:val="1E293B"/>
+          <w:sz w:val="19"/>
+        </w:rPr>
+        <w:t>:</w:t>
+      </w:r>
+    </w:p>
+    <w:p>
+      <w:pPr>
+        <w:spacing w:before="20" w:after="40" w:line="276" w:lineRule="auto"/>
+        <w:ind w:left="720"/>
+      </w:pPr>
+      <w:r>
+        <w:rPr>
+          <w:rFonts w:ascii="Arial" w:hAnsi="Arial"/>
+          <w:b/>
+          <w:color w:val="2563EB"/>
+          <w:sz w:val="19"/>
+        </w:rPr>
+        <w:t xml:space="preserve">⁃ </w:t>
+      </w:r>
+      <w:r>
+        <w:rPr>
+          <w:rFonts w:ascii="Calibri" w:hAnsi="Calibri"/>
+          <w:b w:val="0"/>
+          <w:i w:val="0"/>
+          <w:color w:val="1E293B"/>
+          <w:sz w:val="19"/>
+        </w:rPr>
+        <w:t>Banner cover foto profil membentang panoramik penuh (</w:t>
+      </w:r>
+      <w:r>
+        <w:rPr>
+          <w:rFonts w:ascii="Calibri" w:hAnsi="Calibri"/>
+          <w:b w:val="0"/>
+          <w:i/>
+          <w:color w:val="1E293B"/>
+          <w:sz w:val="19"/>
+        </w:rPr>
+        <w:t>Ultra-Wide Panoramic Banner</w:t>
+      </w:r>
+      <w:r>
+        <w:rPr>
+          <w:rFonts w:ascii="Calibri" w:hAnsi="Calibri"/>
+          <w:b w:val="0"/>
+          <w:i w:val="0"/>
+          <w:color w:val="1E293B"/>
+          <w:sz w:val="19"/>
+        </w:rPr>
+        <w:t>).</w:t>
+      </w:r>
+    </w:p>
+    <w:p>
+      <w:pPr>
+        <w:spacing w:before="20" w:after="40" w:line="276" w:lineRule="auto"/>
+        <w:ind w:left="720"/>
+      </w:pPr>
+      <w:r>
+        <w:rPr>
+          <w:rFonts w:ascii="Arial" w:hAnsi="Arial"/>
+          <w:b/>
+          <w:color w:val="2563EB"/>
+          <w:sz w:val="19"/>
+        </w:rPr>
+        <w:t xml:space="preserve">⁃ </w:t>
+      </w:r>
+      <w:r>
+        <w:rPr>
+          <w:rFonts w:ascii="Calibri" w:hAnsi="Calibri"/>
+          <w:b w:val="0"/>
+          <w:i w:val="0"/>
+          <w:color w:val="1E293B"/>
+          <w:sz w:val="19"/>
+        </w:rPr>
+        <w:t>Formulir identitas akun, pemilihan galeri cover latar, dan ganti kata sandi tertata proporsional tanpa pembatasan lebar horizontal.</w:t>
+      </w:r>
+    </w:p>
+    <w:p>
+      <w:pPr>
+        <w:spacing w:before="20" w:after="40" w:line="276" w:lineRule="auto"/>
+        <w:ind w:left="360"/>
+      </w:pPr>
+      <w:r>
+        <w:rPr>
+          <w:rFonts w:ascii="Arial" w:hAnsi="Arial"/>
+          <w:b/>
+          <w:color w:val="2563EB"/>
+          <w:sz w:val="19"/>
+        </w:rPr>
+        <w:t xml:space="preserve">• </w:t>
+      </w:r>
+      <w:r>
+        <w:rPr>
+          <w:rFonts w:ascii="Calibri" w:hAnsi="Calibri"/>
+          <w:b/>
+          <w:i w:val="0"/>
+          <w:color w:val="1E293B"/>
+          <w:sz w:val="19"/>
+        </w:rPr>
+        <w:t>5.21.5 Edit Proyek &amp; Manajemen Finansial (`/Project/Edit/{id}`)</w:t>
+      </w:r>
+      <w:r>
+        <w:rPr>
+          <w:rFonts w:ascii="Calibri" w:hAnsi="Calibri"/>
+          <w:b w:val="0"/>
+          <w:i w:val="0"/>
+          <w:color w:val="1E293B"/>
+          <w:sz w:val="19"/>
+        </w:rPr>
+        <w:t>:</w:t>
+      </w:r>
+    </w:p>
+    <w:p>
+      <w:pPr>
+        <w:spacing w:before="20" w:after="40" w:line="276" w:lineRule="auto"/>
+        <w:ind w:left="720"/>
+      </w:pPr>
+      <w:r>
+        <w:rPr>
+          <w:rFonts w:ascii="Arial" w:hAnsi="Arial"/>
+          <w:b/>
+          <w:color w:val="2563EB"/>
+          <w:sz w:val="19"/>
+        </w:rPr>
+        <w:t xml:space="preserve">⁃ </w:t>
+      </w:r>
+      <w:r>
+        <w:rPr>
+          <w:rFonts w:ascii="Calibri" w:hAnsi="Calibri"/>
+          <w:b w:val="0"/>
+          <w:i w:val="0"/>
+          <w:color w:val="1E293B"/>
+          <w:sz w:val="19"/>
+        </w:rPr>
+        <w:t>Kolom utama 8-kolom memuat nama proyek, deskripsi ruang lingkup, tags, klien, serta anggaran finansial (</w:t>
+      </w:r>
+      <w:r>
+        <w:rPr>
+          <w:rFonts w:ascii="Calibri" w:hAnsi="Calibri"/>
+          <w:b w:val="0"/>
+          <w:i/>
+          <w:color w:val="1E293B"/>
+          <w:sz w:val="19"/>
+        </w:rPr>
+        <w:t>Budget</w:t>
+      </w:r>
+      <w:r>
+        <w:rPr>
+          <w:rFonts w:ascii="Calibri" w:hAnsi="Calibri"/>
+          <w:b w:val="0"/>
+          <w:i w:val="0"/>
+          <w:color w:val="1E293B"/>
+          <w:sz w:val="19"/>
+        </w:rPr>
+        <w:t>) dan biaya aktual (</w:t>
+      </w:r>
+      <w:r>
+        <w:rPr>
+          <w:rFonts w:ascii="Calibri" w:hAnsi="Calibri"/>
+          <w:b w:val="0"/>
+          <w:i/>
+          <w:color w:val="1E293B"/>
+          <w:sz w:val="19"/>
+        </w:rPr>
+        <w:t>Actual Cost</w:t>
+      </w:r>
+      <w:r>
+        <w:rPr>
+          <w:rFonts w:ascii="Calibri" w:hAnsi="Calibri"/>
+          <w:b w:val="0"/>
+          <w:i w:val="0"/>
+          <w:color w:val="1E293B"/>
+          <w:sz w:val="19"/>
+        </w:rPr>
+        <w:t>).</w:t>
+      </w:r>
+    </w:p>
+    <w:p>
+      <w:pPr>
+        <w:spacing w:before="20" w:after="40" w:line="276" w:lineRule="auto"/>
+        <w:ind w:left="720"/>
+      </w:pPr>
+      <w:r>
+        <w:rPr>
+          <w:rFonts w:ascii="Arial" w:hAnsi="Arial"/>
+          <w:b/>
+          <w:color w:val="2563EB"/>
+          <w:sz w:val="19"/>
+        </w:rPr>
+        <w:t xml:space="preserve">⁃ </w:t>
+      </w:r>
+      <w:r>
+        <w:rPr>
+          <w:rFonts w:ascii="Calibri" w:hAnsi="Calibri"/>
+          <w:b w:val="0"/>
+          <w:i w:val="0"/>
+          <w:color w:val="1E293B"/>
+          <w:sz w:val="19"/>
+        </w:rPr>
+        <w:t>Kolom samping 4-kolom memuat status alur kerja (</w:t>
+      </w:r>
+      <w:r>
+        <w:rPr>
+          <w:rFonts w:ascii="Calibri" w:hAnsi="Calibri"/>
+          <w:b w:val="0"/>
+          <w:i/>
+          <w:color w:val="1E293B"/>
+          <w:sz w:val="19"/>
+        </w:rPr>
+        <w:t>Active, Completed, Archived</w:t>
+      </w:r>
+      <w:r>
+        <w:rPr>
+          <w:rFonts w:ascii="Calibri" w:hAnsi="Calibri"/>
+          <w:b w:val="0"/>
+          <w:i w:val="0"/>
+          <w:color w:val="1E293B"/>
+          <w:sz w:val="19"/>
+        </w:rPr>
+        <w:t>), Project Manager (PM), pemilih perusahaan (</w:t>
+      </w:r>
+      <w:r>
+        <w:rPr>
+          <w:rFonts w:ascii="Calibri" w:hAnsi="Calibri"/>
+          <w:b w:val="0"/>
+          <w:i/>
+          <w:color w:val="1E293B"/>
+          <w:sz w:val="19"/>
+        </w:rPr>
+        <w:t>Corporate Code</w:t>
+      </w:r>
+      <w:r>
+        <w:rPr>
+          <w:rFonts w:ascii="Calibri" w:hAnsi="Calibri"/>
+          <w:b w:val="0"/>
+          <w:i w:val="0"/>
+          <w:color w:val="1E293B"/>
+          <w:sz w:val="19"/>
+        </w:rPr>
+        <w:t>), target deadline, dan tema warna visual proyek.</w:t>
+      </w:r>
+    </w:p>
+    <w:p>
+      <w:pPr>
+        <w:keepNext/>
+        <w:spacing w:before="160" w:after="40"/>
+      </w:pPr>
+      <w:r>
+        <w:rPr>
+          <w:rFonts w:ascii="Calibri" w:hAnsi="Calibri"/>
+          <w:b/>
+          <w:color w:val="1E293B"/>
+          <w:sz w:val="23"/>
+        </w:rPr>
+        <w:t>5.22 Paket Pengujian Mutu (Quality Assurance - QA) &amp; Matriks Pelacakan End-to-End</w:t>
+      </w:r>
+    </w:p>
+    <w:p>
+      <w:pPr>
+        <w:spacing w:before="0" w:after="80" w:line="276" w:lineRule="auto"/>
+      </w:pPr>
+      <w:r>
+        <w:rPr>
+          <w:rFonts w:ascii="Calibri" w:hAnsi="Calibri"/>
+          <w:b w:val="0"/>
+          <w:i w:val="0"/>
+          <w:color w:val="1E293B"/>
+          <w:sz w:val="20"/>
+        </w:rPr>
+        <w:t>Sistem dilengkapi paket artefak pengujian mutu terstandarisasi untuk menjamin keandalan fungsional, performa, dan keamanan lintas rilis:</w:t>
+      </w:r>
+    </w:p>
+    <w:p>
+      <w:pPr>
+        <w:spacing w:before="20" w:after="40" w:line="276" w:lineRule="auto"/>
+        <w:ind w:left="360"/>
+      </w:pPr>
+      <w:r>
+        <w:rPr>
+          <w:rFonts w:ascii="Arial" w:hAnsi="Arial"/>
+          <w:b/>
+          <w:color w:val="2563EB"/>
+          <w:sz w:val="19"/>
+        </w:rPr>
+        <w:t xml:space="preserve">• </w:t>
+      </w:r>
+      <w:r>
+        <w:rPr>
+          <w:rFonts w:ascii="Calibri" w:hAnsi="Calibri"/>
+          <w:b/>
+          <w:i w:val="0"/>
+          <w:color w:val="1E293B"/>
+          <w:sz w:val="19"/>
+        </w:rPr>
+        <w:t>5.22.1 Repositori Artefak QA &amp; Berkas Pelacakan Interaktif (`QA/Tracking_Test_Case_E2E_TrackerKerja.xlsx`)</w:t>
+      </w:r>
+      <w:r>
+        <w:rPr>
+          <w:rFonts w:ascii="Calibri" w:hAnsi="Calibri"/>
+          <w:b w:val="0"/>
+          <w:i w:val="0"/>
+          <w:color w:val="1E293B"/>
+          <w:sz w:val="19"/>
+        </w:rPr>
+        <w:t>:</w:t>
+      </w:r>
+    </w:p>
+    <w:p>
+      <w:pPr>
+        <w:spacing w:before="20" w:after="40" w:line="276" w:lineRule="auto"/>
+        <w:ind w:left="720"/>
+      </w:pPr>
+      <w:r>
+        <w:rPr>
+          <w:rFonts w:ascii="Arial" w:hAnsi="Arial"/>
+          <w:b/>
+          <w:color w:val="2563EB"/>
+          <w:sz w:val="19"/>
+        </w:rPr>
+        <w:t xml:space="preserve">⁃ </w:t>
+      </w:r>
+      <w:r>
+        <w:rPr>
+          <w:rFonts w:ascii="Calibri" w:hAnsi="Calibri"/>
+          <w:b w:val="0"/>
+          <w:i/>
+          <w:color w:val="1E293B"/>
+          <w:sz w:val="19"/>
+        </w:rPr>
+        <w:t>Sheet Dashboard &amp; Metrics</w:t>
+      </w:r>
+      <w:r>
+        <w:rPr>
+          <w:rFonts w:ascii="Calibri" w:hAnsi="Calibri"/>
+          <w:b w:val="0"/>
+          <w:i w:val="0"/>
+          <w:color w:val="1E293B"/>
+          <w:sz w:val="19"/>
+        </w:rPr>
+        <w:t>: Ringkasan statistik eksekutif dengan formula dinamis (</w:t>
+      </w:r>
+      <w:r>
+        <w:rPr>
+          <w:rFonts w:ascii="Consolas" w:hAnsi="Consolas"/>
+          <w:b w:val="0"/>
+          <w:i w:val="0"/>
+          <w:color w:val="C2410C"/>
+          <w:sz w:val="17"/>
+        </w:rPr>
+        <w:t>COUNTA</w:t>
+      </w:r>
+      <w:r>
+        <w:rPr>
+          <w:rFonts w:ascii="Calibri" w:hAnsi="Calibri"/>
+          <w:b w:val="0"/>
+          <w:i w:val="0"/>
+          <w:color w:val="1E293B"/>
+          <w:sz w:val="19"/>
+        </w:rPr>
+        <w:t xml:space="preserve">, </w:t>
+      </w:r>
+      <w:r>
+        <w:rPr>
+          <w:rFonts w:ascii="Consolas" w:hAnsi="Consolas"/>
+          <w:b w:val="0"/>
+          <w:i w:val="0"/>
+          <w:color w:val="C2410C"/>
+          <w:sz w:val="17"/>
+        </w:rPr>
+        <w:t>COUNTIF</w:t>
+      </w:r>
+      <w:r>
+        <w:rPr>
+          <w:rFonts w:ascii="Calibri" w:hAnsi="Calibri"/>
+          <w:b w:val="0"/>
+          <w:i w:val="0"/>
+          <w:color w:val="1E293B"/>
+          <w:sz w:val="19"/>
+        </w:rPr>
+        <w:t xml:space="preserve">, </w:t>
+      </w:r>
+      <w:r>
+        <w:rPr>
+          <w:rFonts w:ascii="Consolas" w:hAnsi="Consolas"/>
+          <w:b w:val="0"/>
+          <w:i w:val="0"/>
+          <w:color w:val="C2410C"/>
+          <w:sz w:val="17"/>
+        </w:rPr>
+        <w:t>% Completion</w:t>
+      </w:r>
+      <w:r>
+        <w:rPr>
+          <w:rFonts w:ascii="Calibri" w:hAnsi="Calibri"/>
+          <w:b w:val="0"/>
+          <w:i w:val="0"/>
+          <w:color w:val="1E293B"/>
+          <w:sz w:val="19"/>
+        </w:rPr>
+        <w:t xml:space="preserve">, </w:t>
+      </w:r>
+      <w:r>
+        <w:rPr>
+          <w:rFonts w:ascii="Consolas" w:hAnsi="Consolas"/>
+          <w:b w:val="0"/>
+          <w:i w:val="0"/>
+          <w:color w:val="C2410C"/>
+          <w:sz w:val="17"/>
+        </w:rPr>
+        <w:t>% Pass Rate</w:t>
+      </w:r>
+      <w:r>
+        <w:rPr>
+          <w:rFonts w:ascii="Calibri" w:hAnsi="Calibri"/>
+          <w:b w:val="0"/>
+          <w:i w:val="0"/>
+          <w:color w:val="1E293B"/>
+          <w:sz w:val="19"/>
+        </w:rPr>
+        <w:t>) dan tabel kemajuan 19 modul aplikasi.</w:t>
+      </w:r>
+    </w:p>
+    <w:p>
+      <w:pPr>
+        <w:spacing w:before="20" w:after="40" w:line="276" w:lineRule="auto"/>
+        <w:ind w:left="720"/>
+      </w:pPr>
+      <w:r>
+        <w:rPr>
+          <w:rFonts w:ascii="Arial" w:hAnsi="Arial"/>
+          <w:b/>
+          <w:color w:val="2563EB"/>
+          <w:sz w:val="19"/>
+        </w:rPr>
+        <w:t xml:space="preserve">⁃ </w:t>
+      </w:r>
+      <w:r>
+        <w:rPr>
+          <w:rFonts w:ascii="Calibri" w:hAnsi="Calibri"/>
+          <w:b w:val="0"/>
+          <w:i/>
+          <w:color w:val="1E293B"/>
+          <w:sz w:val="19"/>
+        </w:rPr>
+        <w:t>Sheet E2E Test Cases Master</w:t>
+      </w:r>
+      <w:r>
+        <w:rPr>
+          <w:rFonts w:ascii="Calibri" w:hAnsi="Calibri"/>
+          <w:b w:val="0"/>
+          <w:i w:val="0"/>
+          <w:color w:val="1E293B"/>
+          <w:sz w:val="19"/>
+        </w:rPr>
+        <w:t>: Repositori 65+ skenario pengujian end-to-end terstruktur mencakup alur positif, negatif, keamanan RBAC, dan validasi data dengan dropdown validation serta conditional formatting.</w:t>
+      </w:r>
+    </w:p>
+    <w:p>
+      <w:pPr>
+        <w:spacing w:before="20" w:after="40" w:line="276" w:lineRule="auto"/>
+        <w:ind w:left="720"/>
+      </w:pPr>
+      <w:r>
+        <w:rPr>
+          <w:rFonts w:ascii="Arial" w:hAnsi="Arial"/>
+          <w:b/>
+          <w:color w:val="2563EB"/>
+          <w:sz w:val="19"/>
+        </w:rPr>
+        <w:t xml:space="preserve">⁃ </w:t>
+      </w:r>
+      <w:r>
+        <w:rPr>
+          <w:rFonts w:ascii="Calibri" w:hAnsi="Calibri"/>
+          <w:b w:val="0"/>
+          <w:i/>
+          <w:color w:val="1E293B"/>
+          <w:sz w:val="19"/>
+        </w:rPr>
+        <w:t>Sheet Execution Cycles</w:t>
+      </w:r>
+      <w:r>
+        <w:rPr>
+          <w:rFonts w:ascii="Calibri" w:hAnsi="Calibri"/>
+          <w:b w:val="0"/>
+          <w:i w:val="0"/>
+          <w:color w:val="1E293B"/>
+          <w:sz w:val="19"/>
+        </w:rPr>
+        <w:t>: Pelacakan siklus rilis pengujian (</w:t>
+      </w:r>
+      <w:r>
+        <w:rPr>
+          <w:rFonts w:ascii="Calibri" w:hAnsi="Calibri"/>
+          <w:b w:val="0"/>
+          <w:i/>
+          <w:color w:val="1E293B"/>
+          <w:sz w:val="19"/>
+        </w:rPr>
+        <w:t>Smoke/Sanity, Multi-Company Regression, ClosedXML ARMS Interop, Full E2E Sprint, dan UAT</w:t>
+      </w:r>
+      <w:r>
+        <w:rPr>
+          <w:rFonts w:ascii="Calibri" w:hAnsi="Calibri"/>
+          <w:b w:val="0"/>
+          <w:i w:val="0"/>
+          <w:color w:val="1E293B"/>
+          <w:sz w:val="19"/>
+        </w:rPr>
+        <w:t>).</w:t>
+      </w:r>
+    </w:p>
+    <w:p>
+      <w:pPr>
+        <w:spacing w:before="20" w:after="40" w:line="276" w:lineRule="auto"/>
+        <w:ind w:left="720"/>
+      </w:pPr>
+      <w:r>
+        <w:rPr>
+          <w:rFonts w:ascii="Arial" w:hAnsi="Arial"/>
+          <w:b/>
+          <w:color w:val="2563EB"/>
+          <w:sz w:val="19"/>
+        </w:rPr>
+        <w:t xml:space="preserve">⁃ </w:t>
+      </w:r>
+      <w:r>
+        <w:rPr>
+          <w:rFonts w:ascii="Calibri" w:hAnsi="Calibri"/>
+          <w:b w:val="0"/>
+          <w:i/>
+          <w:color w:val="1E293B"/>
+          <w:sz w:val="19"/>
+        </w:rPr>
+        <w:t>Sheet Defect Log</w:t>
+      </w:r>
+      <w:r>
+        <w:rPr>
+          <w:rFonts w:ascii="Calibri" w:hAnsi="Calibri"/>
+          <w:b w:val="0"/>
+          <w:i w:val="0"/>
+          <w:color w:val="1E293B"/>
+          <w:sz w:val="19"/>
+        </w:rPr>
+        <w:t>: Pencatatan temuan bug terhubung dengan ID Test Case, tingkat keparahan (</w:t>
+      </w:r>
+      <w:r>
+        <w:rPr>
+          <w:rFonts w:ascii="Calibri" w:hAnsi="Calibri"/>
+          <w:b w:val="0"/>
+          <w:i/>
+          <w:color w:val="1E293B"/>
+          <w:sz w:val="19"/>
+        </w:rPr>
+        <w:t>Severity</w:t>
+      </w:r>
+      <w:r>
+        <w:rPr>
+          <w:rFonts w:ascii="Calibri" w:hAnsi="Calibri"/>
+          <w:b w:val="0"/>
+          <w:i w:val="0"/>
+          <w:color w:val="1E293B"/>
+          <w:sz w:val="19"/>
+        </w:rPr>
+        <w:t>), dan penugasan developer.</w:t>
+      </w:r>
+    </w:p>
+    <w:p>
+      <w:pPr>
+        <w:spacing w:before="20" w:after="40" w:line="276" w:lineRule="auto"/>
+        <w:ind w:left="360"/>
+      </w:pPr>
+      <w:r>
+        <w:rPr>
+          <w:rFonts w:ascii="Arial" w:hAnsi="Arial"/>
+          <w:b/>
+          <w:color w:val="2563EB"/>
+          <w:sz w:val="19"/>
+        </w:rPr>
+        <w:t xml:space="preserve">• </w:t>
+      </w:r>
+      <w:r>
+        <w:rPr>
+          <w:rFonts w:ascii="Calibri" w:hAnsi="Calibri"/>
+          <w:b/>
+          <w:i w:val="0"/>
+          <w:color w:val="1E293B"/>
+          <w:sz w:val="19"/>
+        </w:rPr>
+        <w:t>5.22.2 Cakupan 65+ Skenario Uji E2E Melintasi 19 Modul Sistem</w:t>
+      </w:r>
+      <w:r>
+        <w:rPr>
+          <w:rFonts w:ascii="Calibri" w:hAnsi="Calibri"/>
+          <w:b w:val="0"/>
+          <w:i w:val="0"/>
+          <w:color w:val="1E293B"/>
+          <w:sz w:val="19"/>
+        </w:rPr>
+        <w:t>:</w:t>
+      </w:r>
+    </w:p>
+    <w:p>
+      <w:pPr>
+        <w:spacing w:before="20" w:after="40" w:line="276" w:lineRule="auto"/>
+        <w:ind w:left="720"/>
+      </w:pPr>
+      <w:r>
+        <w:rPr>
+          <w:rFonts w:ascii="Arial" w:hAnsi="Arial"/>
+          <w:b/>
+          <w:color w:val="2563EB"/>
+          <w:sz w:val="19"/>
+        </w:rPr>
+        <w:t xml:space="preserve">⁃ </w:t>
+      </w:r>
+      <w:r>
+        <w:rPr>
+          <w:rFonts w:ascii="Calibri" w:hAnsi="Calibri"/>
+          <w:b w:val="0"/>
+          <w:i w:val="0"/>
+          <w:color w:val="1E293B"/>
+          <w:sz w:val="19"/>
+        </w:rPr>
+        <w:t>Menguji Autentikasi Ganda, Multi-Company Isolation, Manajemen Proyek, Parenting Tugas, Kanban Board, Timesheet &amp; Multi-Timer, Presensi &amp; Rekonsiliasi, Catatan &amp; Upload File, Import/Export ClosedXML (9-kolom &amp; ARMS 21-kolom), Direktori Tim, Kalender, Developer Tools (SQL &amp; JSON), Audit Trail, Master Data, Gamifikasi, Notifikasi SMTP, Sinkronisasi Host Induk, Tema &amp; Font Engine, serta REST API &amp; Swagger Bearer Token.</w:t>
+      </w:r>
+    </w:p>
+    <w:p>
+      <w:pPr>
+        <w:spacing w:before="20" w:after="40" w:line="276" w:lineRule="auto"/>
+        <w:ind w:left="360"/>
+      </w:pPr>
+      <w:r>
+        <w:rPr>
+          <w:rFonts w:ascii="Arial" w:hAnsi="Arial"/>
+          <w:b/>
+          <w:color w:val="2563EB"/>
+          <w:sz w:val="19"/>
+        </w:rPr>
+        <w:t xml:space="preserve">• </w:t>
+      </w:r>
+      <w:r>
+        <w:rPr>
+          <w:rFonts w:ascii="Calibri" w:hAnsi="Calibri"/>
+          <w:b/>
+          <w:i w:val="0"/>
+          <w:color w:val="1E293B"/>
+          <w:sz w:val="19"/>
+        </w:rPr>
+        <w:t>5.22.3 Standar Operasional QA (`QA/README.md`)</w:t>
+      </w:r>
+      <w:r>
+        <w:rPr>
+          <w:rFonts w:ascii="Calibri" w:hAnsi="Calibri"/>
+          <w:b w:val="0"/>
+          <w:i w:val="0"/>
+          <w:color w:val="1E293B"/>
+          <w:sz w:val="19"/>
+        </w:rPr>
+        <w:t>:</w:t>
+      </w:r>
+    </w:p>
+    <w:p>
+      <w:pPr>
+        <w:spacing w:before="20" w:after="40" w:line="276" w:lineRule="auto"/>
+        <w:ind w:left="720"/>
+      </w:pPr>
+      <w:r>
+        <w:rPr>
+          <w:rFonts w:ascii="Arial" w:hAnsi="Arial"/>
+          <w:b/>
+          <w:color w:val="2563EB"/>
+          <w:sz w:val="19"/>
+        </w:rPr>
+        <w:t xml:space="preserve">⁃ </w:t>
+      </w:r>
+      <w:r>
+        <w:rPr>
+          <w:rFonts w:ascii="Calibri" w:hAnsi="Calibri"/>
+          <w:b w:val="0"/>
+          <w:i w:val="0"/>
+          <w:color w:val="1E293B"/>
+          <w:sz w:val="19"/>
+        </w:rPr>
+        <w:t>Konvensi penamaan test case (</w:t>
+      </w:r>
+      <w:r>
+        <w:rPr>
+          <w:rFonts w:ascii="Consolas" w:hAnsi="Consolas"/>
+          <w:b w:val="0"/>
+          <w:i w:val="0"/>
+          <w:color w:val="C2410C"/>
+          <w:sz w:val="17"/>
+        </w:rPr>
+        <w:t>TC-[MODUL]-[NO]</w:t>
+      </w:r>
+      <w:r>
+        <w:rPr>
+          <w:rFonts w:ascii="Calibri" w:hAnsi="Calibri"/>
+          <w:b w:val="0"/>
+          <w:i w:val="0"/>
+          <w:color w:val="1E293B"/>
+          <w:sz w:val="19"/>
+        </w:rPr>
+        <w:t>), matriks keparahan defect (</w:t>
+      </w:r>
+      <w:r>
+        <w:rPr>
+          <w:rFonts w:ascii="Calibri" w:hAnsi="Calibri"/>
+          <w:b w:val="0"/>
+          <w:i/>
+          <w:color w:val="1E293B"/>
+          <w:sz w:val="19"/>
+        </w:rPr>
+        <w:t>Blocker, Major, Moderate, Minor</w:t>
+      </w:r>
+      <w:r>
+        <w:rPr>
+          <w:rFonts w:ascii="Calibri" w:hAnsi="Calibri"/>
+          <w:b w:val="0"/>
+          <w:i w:val="0"/>
+          <w:color w:val="1E293B"/>
+          <w:sz w:val="19"/>
+        </w:rPr>
+        <w:t>), dan tata cara sign-off pengujian.</w:t>
+      </w:r>
+    </w:p>
+    <w:p>
+      <w:pPr>
         <w:spacing w:before="120" w:after="120"/>
       </w:pPr>
       <w:r>
@@ -24523,7 +25905,7 @@
         <w:color w:val="94A3B8"/>
         <w:sz w:val="17"/>
       </w:rPr>
-      <w:t>Work Tracker Pro v3.7 • Multi-Company &amp; Project Financials Edition</w:t>
+      <w:t>Work Tracker Pro v3.8 • Multi-Company &amp; Project Financials Edition</w:t>
     </w:r>
     <w:r>
       <w:tab/>
@@ -24565,7 +25947,7 @@
         <w:color w:val="94A3B8"/>
         <w:sz w:val="17"/>
       </w:rPr>
-      <w:t>Work Tracker Pro v3.7  |  FSD Work Tracker Pro v3.7</w:t>
+      <w:t>Work Tracker Pro v3.8  |  FSD Work Tracker Pro v3.8</w:t>
     </w:r>
   </w:p>
 </w:hdr>

</xml_diff>